<commit_message>
Cover explanation: describe option 2 land colours (gold and dark grey)
Co-Authored-By: Claude Opus 5.5 <noreply@anthropic.com>
Claude-Session: https://claude.ai/code/session_01RaAHJjFzQLBQzv3hdCW4ED
</commit_message>
<xml_diff>
--- a/cover-proposals/表紙3案_説明とおすすめ.docx
+++ b/cover-proposals/表紙3案_説明とおすすめ.docx
@@ -125,7 +125,7 @@
               <w:t xml:space="preserve">制作の意図　</w:t>
             </w:r>
             <w:r>
-              <w:t>アジア・オセアニアを中心にした透明感のある地球儀と、その周りを巡る金色の軌道線で、「日本を起点に世界の資源と需要をつなぐ」姿を表現。初めて三菱商事を知る読み手にも、国際的な企業であることが一瞬で伝わる案として制作しました。</w:t>
+              <w:t>アジア・オセアニアを中心にした透明感のある地球儀と、その周りを巡る金色の軌道線で、「日本を起点に世界の資源と需要をつなぐ」姿を表現。大陸（国土）は、金や鉱石を想起させる金色と濃いグレーで塗り分け、地球儀そのものが「金属資源」を語るようにしました。初めて三菱商事を知る読み手にも、国際的な金属資源の企業であることが一瞬で伝わる案として制作しました。</w:t>
             </w:r>
           </w:p>
           <w:p>
@@ -139,7 +139,7 @@
               <w:t xml:space="preserve">見どころ　</w:t>
             </w:r>
             <w:r>
-              <w:t>・最も分かりやすく、誰に渡しても誤解のない明快さ　・白地に大きな地球儀と広い余白で、明るく開かれた印象　・金色の軌道線を中面の地図や図解に展開でき、冊子全体を統一しやすい</w:t>
+              <w:t>・国土を金色と濃いグレーで表し、世界の大地に眠る鉱物資源を想起させる　・最も分かりやすく、誰に渡しても誤解のない明快さ　・白地に大きな地球儀と広い余白で、明るく開かれた印象　・金色の軌道線を中面の地図や図解に展開でき、冊子全体を統一しやすい</w:t>
             </w:r>
           </w:p>
         </w:tc>

</xml_diff>

<commit_message>
Cover explanation: designer colour names for option 2
Co-Authored-By: Claude Opus 5.5 <noreply@anthropic.com>
Claude-Session: https://claude.ai/code/session_01RaAHJjFzQLBQzv3hdCW4ED
</commit_message>
<xml_diff>
--- a/cover-proposals/表紙3案_説明とおすすめ.docx
+++ b/cover-proposals/表紙3案_説明とおすすめ.docx
@@ -125,7 +125,7 @@
               <w:t xml:space="preserve">制作の意図　</w:t>
             </w:r>
             <w:r>
-              <w:t>アジア・オセアニアを中心にした透明感のある地球儀と、その周りを巡る金色の軌道線で、「日本を起点に世界の資源と需要をつなぐ」姿を表現。大陸（国土）は、金や鉱石を想起させる金色と濃いグレーで塗り分け、地球儀そのものが「金属資源」を語るようにしました。初めて三菱商事を知る読み手にも、国際的な金属資源の企業であることが一瞬で伝わる案として制作しました。</w:t>
+              <w:t>アジア・オセアニアを中心にした透明感のある地球儀と、その周りを巡る金色の軌道線で、「日本を起点に世界の資源と需要をつなぐ」姿を表現。大陸（国土）は、鉱物の輝きを想起させるシャンパンゴールドと、鉱石の深みを思わせるグラファイトグレーで塗り分け、地球儀そのものが「金属資源」を語るようにしました。初めて三菱商事を知る読み手にも、国際的な金属資源の企業であることが一瞬で伝わる案として制作しました。</w:t>
             </w:r>
           </w:p>
           <w:p>
@@ -139,7 +139,7 @@
               <w:t xml:space="preserve">見どころ　</w:t>
             </w:r>
             <w:r>
-              <w:t>・国土を金色と濃いグレーで表し、世界の大地に眠る鉱物資源を想起させる　・最も分かりやすく、誰に渡しても誤解のない明快さ　・白地に大きな地球儀と広い余白で、明るく開かれた印象　・金色の軌道線を中面の地図や図解に展開でき、冊子全体を統一しやすい</w:t>
+              <w:t>・国土をシャンパンゴールドとグラファイトグレーで表し、世界の大地に眠る鉱物資源を想起させる　・最も分かりやすく、誰に渡しても誤解のない明快さ　・白地に大きな地球儀と広い余白で、明るく開かれた印象　・金色の軌道線を中面の地図や図解に展開でき、冊子全体を統一しやすい</w:t>
             </w:r>
           </w:p>
         </w:tc>

</xml_diff>

<commit_message>
Cover explanation: add designer's view per option and AI process note
Co-Authored-By: Claude Opus 5.5 <noreply@anthropic.com>
Claude-Session: https://claude.ai/code/session_01RaAHJjFzQLBQzv3hdCW4ED
</commit_message>
<xml_diff>
--- a/cover-proposals/表紙3案_説明とおすすめ.docx
+++ b/cover-proposals/表紙3案_説明とおすすめ.docx
@@ -10,193 +10,10 @@
         <w:rPr>
           <w:b w:val="0"/>
           <w:color w:val="666666"/>
-          <w:sz w:val="16"/>
+          <w:sz w:val="15"/>
         </w:rPr>
         <w:t>金属資源グループ 会社案内（英語版）</w:t>
       </w:r>
-    </w:p>
-    <w:p>
-      <w:pPr>
-        <w:spacing w:after="60" w:before="0"/>
-      </w:pPr>
-      <w:r>
-        <w:rPr>
-          <w:b/>
-          <w:sz w:val="28"/>
-        </w:rPr>
-        <w:t>表紙デザイン3案　制作の意図と見どころ</w:t>
-      </w:r>
-    </w:p>
-    <w:p>
-      <w:pPr>
-        <w:spacing w:after="100" w:before="0"/>
-      </w:pPr>
-      <w:r>
-        <w:rPr>
-          <w:b w:val="0"/>
-          <w:sz w:val="16"/>
-        </w:rPr>
-        <w:t>3案共通の軸：海外の商談相手（ニューヨーク・ロンドンのビジネスパーソンを想定）が手に取り、「ひと目で金属資源の会社と分かる」「白を基調とした品格」「日本企業らしさ」の3点を満たすこと。</w:t>
-      </w:r>
-    </w:p>
-    <w:tbl>
-      <w:tblPr>
-        <w:tblW w:type="auto" w:w="0"/>
-        <w:tblLayout w:type="autofit"/>
-        <w:tblLook w:firstColumn="1" w:firstRow="1" w:lastColumn="0" w:lastRow="0" w:noHBand="0" w:noVBand="1" w:val="04A0"/>
-      </w:tblPr>
-      <w:tblGrid>
-        <w:gridCol w:w="10092"/>
-      </w:tblGrid>
-      <w:tr>
-        <w:tc>
-          <w:tcPr>
-            <w:tcW w:type="dxa" w:w="10092"/>
-            <w:shd w:val="clear" w:color="auto" w:fill="F3F4F5"/>
-          </w:tcPr>
-          <w:p>
-            <w:pPr>
-              <w:spacing w:after="40"/>
-            </w:pPr>
-            <w:r>
-              <w:rPr>
-                <w:b/>
-                <w:sz w:val="20"/>
-              </w:rPr>
-              <w:t>案①　鋼のヘアライン（Steel Hairline）</w:t>
-            </w:r>
-          </w:p>
-          <w:p>
-            <w:pPr>
-              <w:spacing w:after="40"/>
-            </w:pPr>
-            <w:r>
-              <w:rPr>
-                <w:b/>
-              </w:rPr>
-              <w:t xml:space="preserve">制作の意図　</w:t>
-            </w:r>
-            <w:r>
-              <w:t>鋼板の表面仕上げ「ヘアライン（細い筋目）」で世界地図を描き、実際の事業拠点・資産22か所から細い線が上へ立ち上がる構成。コアメッセージ「Strength to Hold. Power to Connect.」を、写真に頼らず“素材”と“つながり”で表現するために制作しました。</w:t>
-            </w:r>
-          </w:p>
-          <w:p>
-            <w:pPr>
-              <w:spacing w:after="80"/>
-            </w:pPr>
-            <w:r>
-              <w:rPr>
-                <w:b/>
-              </w:rPr>
-              <w:t xml:space="preserve">見どころ　</w:t>
-            </w:r>
-            <w:r>
-              <w:t>・図案そのものが「鋼（Strength）」と「世界とのつながり（Connect）」を同時に語る　・線の起点は中面と同じ実在の拠点で、誇張のない“事実でできた絵”　・色は日本と東京から伸びる1本の朱のみ。日の丸を思わせる控えめな和　・銀インキや箔押しで刷ると、手に取ったとき本物の金属のように光る</w:t>
-            </w:r>
-          </w:p>
-        </w:tc>
-      </w:tr>
-      <w:tr>
-        <w:tc>
-          <w:tcPr>
-            <w:tcW w:type="dxa" w:w="10092"/>
-            <w:shd w:val="clear" w:color="auto" w:fill="FFFFFF"/>
-          </w:tcPr>
-          <w:p>
-            <w:pPr>
-              <w:spacing w:after="40"/>
-            </w:pPr>
-            <w:r>
-              <w:rPr>
-                <w:b/>
-                <w:sz w:val="20"/>
-              </w:rPr>
-              <w:t>案②　ガラスの地球儀（Glass Globe）</w:t>
-            </w:r>
-          </w:p>
-          <w:p>
-            <w:pPr>
-              <w:spacing w:after="40"/>
-            </w:pPr>
-            <w:r>
-              <w:rPr>
-                <w:b/>
-              </w:rPr>
-              <w:t xml:space="preserve">制作の意図　</w:t>
-            </w:r>
-            <w:r>
-              <w:t>アジア・オセアニアを中心にした透明感のある地球儀と、その周りを巡る金色の軌道線で、「日本を起点に世界の資源と需要をつなぐ」姿を表現。大陸（国土）は、鉱物の輝きを想起させるシャンパンゴールドと、鉱石の深みを思わせるグラファイトグレーで塗り分け、地球儀そのものが「金属資源」を語るようにしました。初めて三菱商事を知る読み手にも、国際的な金属資源の企業であることが一瞬で伝わる案として制作しました。</w:t>
-            </w:r>
-          </w:p>
-          <w:p>
-            <w:pPr>
-              <w:spacing w:after="80"/>
-            </w:pPr>
-            <w:r>
-              <w:rPr>
-                <w:b/>
-              </w:rPr>
-              <w:t xml:space="preserve">見どころ　</w:t>
-            </w:r>
-            <w:r>
-              <w:t>・国土をシャンパンゴールドとグラファイトグレーで表し、世界の大地に眠る鉱物資源を想起させる　・最も分かりやすく、誰に渡しても誤解のない明快さ　・白地に大きな地球儀と広い余白で、明るく開かれた印象　・金色の軌道線を中面の地図や図解に展開でき、冊子全体を統一しやすい</w:t>
-            </w:r>
-          </w:p>
-        </w:tc>
-      </w:tr>
-      <w:tr>
-        <w:tc>
-          <w:tcPr>
-            <w:tcW w:type="dxa" w:w="10092"/>
-            <w:shd w:val="clear" w:color="auto" w:fill="F3F4F5"/>
-          </w:tcPr>
-          <w:p>
-            <w:pPr>
-              <w:spacing w:after="40"/>
-            </w:pPr>
-            <w:r>
-              <w:rPr>
-                <w:b/>
-                <w:sz w:val="20"/>
-              </w:rPr>
-              <w:t>案③　鉱山のモダンアート（Mine as Modern Art）</w:t>
-            </w:r>
-          </w:p>
-          <w:p>
-            <w:pPr>
-              <w:spacing w:after="40"/>
-            </w:pPr>
-            <w:r>
-              <w:rPr>
-                <w:b/>
-              </w:rPr>
-              <w:t xml:space="preserve">制作の意図　</w:t>
-            </w:r>
-            <w:r>
-              <w:t>貴社サイトに掲載の露天掘り鉱山の写真を縦の短冊に切り、上下にずらして再構成。実際の事業の写真を使いながら、1枚の現代美術作品のように見せることで、商談の場で最も強い第一印象を残す案として制作しました。</w:t>
-            </w:r>
-          </w:p>
-          <w:p>
-            <w:pPr>
-              <w:spacing w:after="80"/>
-            </w:pPr>
-            <w:r>
-              <w:rPr>
-                <w:b/>
-              </w:rPr>
-              <w:t xml:space="preserve">見どころ　</w:t>
-            </w:r>
-            <w:r>
-              <w:t>・写真でありながら抽象画のようなリズムが生まれ、「思わず手に取る」雑誌的な強さ　・露天掘りの圧倒的なスケールが、そのまま事業規模の大きさを伝える　・短冊の段差に朱の正方形を一点だけ置き、画面を引き締める</w:t>
-            </w:r>
-          </w:p>
-        </w:tc>
-      </w:tr>
-    </w:tbl>
-    <w:p>
-      <w:pPr>
-        <w:spacing w:after="0" w:before="80"/>
-      </w:pPr>
     </w:p>
     <w:p>
       <w:pPr>
@@ -205,27 +22,342 @@
       <w:r>
         <w:rPr>
           <w:b/>
-          <w:color w:val="1F3A40"/>
-          <w:sz w:val="21"/>
+          <w:sz w:val="27"/>
         </w:rPr>
-        <w:t>「あなたならどれを選びますか？」と聞かれたら</w:t>
+        <w:t>表紙デザイン3案　制作の意図と見どころ</w:t>
       </w:r>
     </w:p>
     <w:p>
       <w:pPr>
-        <w:spacing w:after="40"/>
+        <w:spacing w:after="80" w:before="0"/>
+      </w:pPr>
+      <w:r>
+        <w:rPr>
+          <w:b w:val="0"/>
+          <w:sz w:val="17"/>
+        </w:rPr>
+        <w:t>3案共通の軸：海外の商談相手（ニューヨーク・ロンドンのビジネスパーソンを想定）が手に取り、「ひと目で金属資源の会社と分かる」「白を基調とした品格」「日本企業らしさ」の3点を満たすこと。3案とも、白地・細身の書体・色数を絞った構成とし、違いは「何で金属資源を語るか（素材／地球／現場）」に置いています。</w:t>
+      </w:r>
+    </w:p>
+    <w:tbl>
+      <w:tblPr>
+        <w:tblW w:type="auto" w:w="0"/>
+        <w:tblLook w:firstColumn="1" w:firstRow="1" w:lastColumn="0" w:lastRow="0" w:noHBand="0" w:noVBand="1" w:val="04A0"/>
+      </w:tblPr>
+      <w:tblGrid>
+        <w:gridCol w:w="10318"/>
+      </w:tblGrid>
+      <w:tr>
+        <w:tc>
+          <w:tcPr>
+            <w:tcW w:type="dxa" w:w="10318"/>
+            <w:shd w:val="clear" w:color="auto" w:fill="F3F4F5"/>
+          </w:tcPr>
+          <w:p>
+            <w:pPr>
+              <w:spacing w:after="30"/>
+            </w:pPr>
+            <w:r>
+              <w:rPr>
+                <w:b/>
+                <w:sz w:val="19"/>
+              </w:rPr>
+              <w:t>案①　鋼のヘアライン（Steel Hairline）</w:t>
+            </w:r>
+          </w:p>
+          <w:p>
+            <w:pPr>
+              <w:spacing w:after="30"/>
+            </w:pPr>
+            <w:r>
+              <w:rPr>
+                <w:b/>
+                <w:color w:val="1F3A40"/>
+              </w:rPr>
+              <w:t xml:space="preserve">制作の意図　</w:t>
+            </w:r>
+            <w:r>
+              <w:t>鋼板の表面仕上げ「ヘアライン（細い筋目）」で世界地図を描き、実際の事業拠点・資産22か所から細い線が上へ立ち上がる構成。コアメッセージ「Strength to Hold. Power to Connect.」を、写真に頼らず“素材”と“つながり”で表現しました。</w:t>
+            </w:r>
+          </w:p>
+          <w:p>
+            <w:pPr>
+              <w:spacing w:after="10"/>
+            </w:pPr>
+            <w:r>
+              <w:rPr>
+                <w:b/>
+                <w:color w:val="1F3A40"/>
+              </w:rPr>
+              <w:t>デザイナーの視点</w:t>
+            </w:r>
+          </w:p>
+          <w:p>
+            <w:pPr>
+              <w:spacing w:after="10"/>
+              <w:ind w:left="170" w:hanging="170"/>
+            </w:pPr>
+            <w:r>
+              <w:t>・素材を「描く」のではなく「質感として見せる」：線は極細にし、左右方向に明暗を変えることで、光を受けた鋼板の反射を再現。印刷では銀インキや箔押しに置き換えられる設計です。</w:t>
+            </w:r>
+          </w:p>
+          <w:p>
+            <w:pPr>
+              <w:spacing w:after="10"/>
+              <w:ind w:left="170" w:hanging="170"/>
+            </w:pPr>
+            <w:r>
+              <w:t>・縦長の紙面を「上昇」に使う：地図を紙面の下に置いて“大地”とし、線を上へ伸ばすことで、資源が世界から立ち上がり、つながっていく動きを生みました。</w:t>
+            </w:r>
+          </w:p>
+          <w:p>
+            <w:pPr>
+              <w:spacing w:after="10"/>
+              <w:ind w:left="170" w:hanging="170"/>
+            </w:pPr>
+            <w:r>
+              <w:t>・視線の流れを設計：タイトルの真下では線を止めて可読性を守り、右側だけ線を高く伸ばすことで、視線が「タイトル → 朱の線 → 日本 → 世界」へと自然に降りていきます。</w:t>
+            </w:r>
+          </w:p>
+          <w:p>
+            <w:pPr>
+              <w:spacing w:after="30"/>
+              <w:ind w:left="170" w:hanging="170"/>
+            </w:pPr>
+            <w:r>
+              <w:t>・色は「情報」としてだけ使う：朱は日本と東京から伸びる1本のみ。装飾ではなく「起点はここ」という意味を持たせた一点です。</w:t>
+            </w:r>
+          </w:p>
+          <w:p>
+            <w:pPr>
+              <w:spacing w:after="60"/>
+            </w:pPr>
+            <w:r>
+              <w:rPr>
+                <w:b/>
+                <w:color w:val="1F3A40"/>
+              </w:rPr>
+              <w:t xml:space="preserve">見どころ　</w:t>
+            </w:r>
+            <w:r>
+              <w:t>図案そのものが「鋼（Strength）」と「つながり（Connect）」を同時に語る／線の起点は中面と同じ実在の拠点で、誇張のない“事実でできた絵”／日の丸を思わせる控えめな和</w:t>
+            </w:r>
+          </w:p>
+        </w:tc>
+      </w:tr>
+      <w:tr>
+        <w:tc>
+          <w:tcPr>
+            <w:tcW w:type="dxa" w:w="10318"/>
+            <w:shd w:val="clear" w:color="auto" w:fill="FFFFFF"/>
+          </w:tcPr>
+          <w:p>
+            <w:pPr>
+              <w:spacing w:after="30"/>
+            </w:pPr>
+            <w:r>
+              <w:rPr>
+                <w:b/>
+                <w:sz w:val="19"/>
+              </w:rPr>
+              <w:t>案②　ガラスの地球儀（Glass Globe）</w:t>
+            </w:r>
+          </w:p>
+          <w:p>
+            <w:pPr>
+              <w:spacing w:after="30"/>
+            </w:pPr>
+            <w:r>
+              <w:rPr>
+                <w:b/>
+                <w:color w:val="1F3A40"/>
+              </w:rPr>
+              <w:t xml:space="preserve">制作の意図　</w:t>
+            </w:r>
+            <w:r>
+              <w:t>アジア・オセアニアを中心にした透明感のある地球儀と、その周りを巡る金色の軌道線で、「日本を起点に世界の資源と需要をつなぐ」姿を表現。大陸（国土）は、鉱物の輝きを想起させるシャンパンゴールドと、鉱石の深みを思わせるグラファイトグレーで塗り分け、地球儀そのものが「金属資源」を語るようにしました。</w:t>
+            </w:r>
+          </w:p>
+          <w:p>
+            <w:pPr>
+              <w:spacing w:after="10"/>
+            </w:pPr>
+            <w:r>
+              <w:rPr>
+                <w:b/>
+                <w:color w:val="1F3A40"/>
+              </w:rPr>
+              <w:t>デザイナーの視点</w:t>
+            </w:r>
+          </w:p>
+          <w:p>
+            <w:pPr>
+              <w:spacing w:after="10"/>
+              <w:ind w:left="170" w:hanging="170"/>
+            </w:pPr>
+            <w:r>
+              <w:t>・地球の「向き」を選ぶ：一般的な大西洋中心ではなく、日本と豪州・南米の資源国の関係が見えるアジア・オセアニア中心の角度を選び、事業の地理を一枚で伝えます。</w:t>
+            </w:r>
+          </w:p>
+          <w:p>
+            <w:pPr>
+              <w:spacing w:after="10"/>
+              <w:ind w:left="170" w:hanging="170"/>
+            </w:pPr>
+            <w:r>
+              <w:t>・素材で姿勢を語る：ガラスの透明感は、コアメッセージにある「フェアな立場」「多様なパートナーとの間に立つ」姿勢の暗示でもあります。</w:t>
+            </w:r>
+          </w:p>
+          <w:p>
+            <w:pPr>
+              <w:spacing w:after="10"/>
+              <w:ind w:left="170" w:hanging="170"/>
+            </w:pPr>
+            <w:r>
+              <w:t>・色の質感にこだわる：金は派手さを抑えたシャンパンゴールド、グレーは鉱物（黒鉛）の名を持つグラファイト。高級感を出しつつ、誇示しないトーンに収めています。</w:t>
+            </w:r>
+          </w:p>
+          <w:p>
+            <w:pPr>
+              <w:spacing w:after="30"/>
+              <w:ind w:left="170" w:hanging="170"/>
+            </w:pPr>
+            <w:r>
+              <w:t>・軌道線＝循環と持続：地球を巡る細い楕円は、資源の流れと「持続的な安定供給」というグループミッションを、言葉を使わずに表します。</w:t>
+            </w:r>
+          </w:p>
+          <w:p>
+            <w:pPr>
+              <w:spacing w:after="60"/>
+            </w:pPr>
+            <w:r>
+              <w:rPr>
+                <w:b/>
+                <w:color w:val="1F3A40"/>
+              </w:rPr>
+              <w:t xml:space="preserve">見どころ　</w:t>
+            </w:r>
+            <w:r>
+              <w:t>最も分かりやすく、誰に渡しても誤解のない明快さ／白地と広い余白で明るく開かれた印象／金色の軌道線を中面の地図や図解に展開でき、冊子全体を統一しやすい</w:t>
+            </w:r>
+          </w:p>
+        </w:tc>
+      </w:tr>
+      <w:tr>
+        <w:tc>
+          <w:tcPr>
+            <w:tcW w:type="dxa" w:w="10318"/>
+            <w:shd w:val="clear" w:color="auto" w:fill="F3F4F5"/>
+          </w:tcPr>
+          <w:p>
+            <w:pPr>
+              <w:spacing w:after="30"/>
+            </w:pPr>
+            <w:r>
+              <w:rPr>
+                <w:b/>
+                <w:sz w:val="19"/>
+              </w:rPr>
+              <w:t>案③　鉱山のモダンアート（Mine as Modern Art）</w:t>
+            </w:r>
+          </w:p>
+          <w:p>
+            <w:pPr>
+              <w:spacing w:after="30"/>
+            </w:pPr>
+            <w:r>
+              <w:rPr>
+                <w:b/>
+                <w:color w:val="1F3A40"/>
+              </w:rPr>
+              <w:t xml:space="preserve">制作の意図　</w:t>
+            </w:r>
+            <w:r>
+              <w:t>貴社サイトに掲載の露天掘り鉱山の写真を縦の短冊に切り、上下にずらして再構成。実際の事業の写真を使いながら、1枚の現代美術作品のように見せ、商談の場で最も強い第一印象を残す案です。</w:t>
+            </w:r>
+          </w:p>
+          <w:p>
+            <w:pPr>
+              <w:spacing w:after="10"/>
+            </w:pPr>
+            <w:r>
+              <w:rPr>
+                <w:b/>
+                <w:color w:val="1F3A40"/>
+              </w:rPr>
+              <w:t>デザイナーの視点</w:t>
+            </w:r>
+          </w:p>
+          <w:p>
+            <w:pPr>
+              <w:spacing w:after="10"/>
+              <w:ind w:left="170" w:hanging="170"/>
+            </w:pPr>
+            <w:r>
+              <w:t>・「記録写真」を「作品」に変える：切ってずらすという一手間だけで、見慣れた鉱山写真が抽象画のように見え、思わず手が止まる表紙になります。</w:t>
+            </w:r>
+          </w:p>
+          <w:p>
+            <w:pPr>
+              <w:spacing w:after="10"/>
+              <w:ind w:left="170" w:hanging="170"/>
+            </w:pPr>
+            <w:r>
+              <w:t>・鉱山の構造と呼応させる：短冊の段差は、露天掘りの段々（ベンチ）や地層の重なりと響き合い、長い時間をかけて資源を育てる事業の時間軸も感じさせます。</w:t>
+            </w:r>
+          </w:p>
+          <w:p>
+            <w:pPr>
+              <w:spacing w:after="10"/>
+              <w:ind w:left="170" w:hanging="170"/>
+            </w:pPr>
+            <w:r>
+              <w:t>・規則と不規則のバランス：短冊は等幅のグリッドで揃え、ずれ幅だけを不規則にすることで、整然さとリズムを両立させています。</w:t>
+            </w:r>
+          </w:p>
+          <w:p>
+            <w:pPr>
+              <w:spacing w:after="30"/>
+              <w:ind w:left="170" w:hanging="170"/>
+            </w:pPr>
+            <w:r>
+              <w:t>・朱の一点で締める：段差の足元に小さな朱の正方形を置き、画面の重心と「起点」を示しています。中面でも同じ手法を繰り返し、シリーズとしての一体感を出せます。</w:t>
+            </w:r>
+          </w:p>
+          <w:p>
+            <w:pPr>
+              <w:spacing w:after="60"/>
+            </w:pPr>
+            <w:r>
+              <w:rPr>
+                <w:b/>
+                <w:color w:val="1F3A40"/>
+              </w:rPr>
+              <w:t xml:space="preserve">見どころ　</w:t>
+            </w:r>
+            <w:r>
+              <w:t>写真でありながら抽象画のような強さ／露天掘りの圧倒的なスケールが、そのまま事業規模を伝える／中面の写真まで一貫した表現に展開できる</w:t>
+            </w:r>
+          </w:p>
+        </w:tc>
+      </w:tr>
+    </w:tbl>
+    <w:p>
+      <w:pPr>
+        <w:spacing w:after="0" w:before="60"/>
+      </w:pPr>
+    </w:p>
+    <w:p>
+      <w:pPr>
+        <w:spacing w:after="20" w:before="0"/>
       </w:pPr>
       <w:r>
         <w:rPr>
           <w:b/>
+          <w:color w:val="1F3A40"/>
+          <w:sz w:val="19"/>
         </w:rPr>
-        <w:t>答え：</w:t>
-      </w:r>
-      <w:r>
-        <w:rPr>
-          <w:b/>
-        </w:rPr>
-        <w:t>「私は案①です。3案の中で唯一、表紙だけでコアメッセージを言い切れているからです。」</w:t>
+        <w:t>「あなたならどれを選びますか？」と聞かれたら</w:t>
       </w:r>
     </w:p>
     <w:p>
@@ -236,18 +368,26 @@
         <w:rPr>
           <w:b/>
         </w:rPr>
-        <w:t>① メッセージと一致している。</w:t>
-      </w:r>
-      <w:r>
-        <w:rPr>
-          <w:b w:val="0"/>
-        </w:rPr>
-        <w:t>“Strength to Hold”を鋼の質感で、“Power to Connect”を拠点から立ち上がる線で表しており、冊子を開く前から主張が伝わります。案②は「グローバル」、案③は「スケール」を伝えますが、貴グループならではの「持つ力とつなぐ力」まで語れるのは案①です。</w:t>
+        <w:t>「私は案①です。3案の中で唯一、表紙だけでコアメッセージを言い切れているからです。」</w:t>
       </w:r>
     </w:p>
     <w:p>
       <w:pPr>
-        <w:spacing w:after="20"/>
+        <w:spacing w:after="10"/>
+      </w:pPr>
+      <w:r>
+        <w:rPr>
+          <w:b/>
+        </w:rPr>
+        <w:t>① メッセージと一致している。</w:t>
+      </w:r>
+      <w:r>
+        <w:t>“Strength to Hold”を鋼の質感で、“Power to Connect”を拠点から立ち上がる線で表し、冊子を開く前から主張が伝わります。</w:t>
+      </w:r>
+    </w:p>
+    <w:p>
+      <w:pPr>
+        <w:spacing w:after="10"/>
       </w:pPr>
       <w:r>
         <w:rPr>
@@ -256,15 +396,12 @@
         <w:t>② 事実でできていて、誇示がない。</w:t>
       </w:r>
       <w:r>
-        <w:rPr>
-          <w:b w:val="0"/>
-        </w:rPr>
-        <w:t>線の起点は中面と同じ実在の22拠点です。ストーリーラインの「優位性を誇示しない」という方針に、表紙の段階から沿っています。</w:t>
+        <w:t>線の起点は中面と同じ実在の22拠点。ストーリーラインの「優位性を誇示しない」方針に、表紙の段階から沿っています。</w:t>
       </w:r>
     </w:p>
     <w:p>
       <w:pPr>
-        <w:spacing w:after="20"/>
+        <w:spacing w:after="10"/>
       </w:pPr>
       <w:r>
         <w:rPr>
@@ -273,15 +410,12 @@
         <w:t>③ 投資と販売の“両輪”に偏りがない。</w:t>
       </w:r>
       <w:r>
-        <w:rPr>
-          <w:b w:val="0"/>
-        </w:rPr>
-        <w:t>鉱山写真（案③）は川上の印象が強く、トレーディングの姿が見えにくくなります。地図と線の表現は、投資と販売の両方を含む事業全体を等しく表せます。</w:t>
+        <w:t>鉱山写真は川上の印象が強くなりますが、地図と線の表現は投資と販売を含む事業全体を等しく表せます。</w:t>
       </w:r>
     </w:p>
     <w:p>
       <w:pPr>
-        <w:spacing w:after="20"/>
+        <w:spacing w:after="10"/>
       </w:pPr>
       <w:r>
         <w:rPr>
@@ -290,15 +424,12 @@
         <w:t>④ 長く使え、本制作で品質が上がる。</w:t>
       </w:r>
       <w:r>
-        <w:rPr>
-          <w:b w:val="0"/>
-        </w:rPr>
-        <w:t>写真の使用許諾や解像度に左右されず、印刷加工（銀・箔・特色の朱）で完成度を高められます。英語版の後に他言語版を作る場合も、同じ表紙を使い続けられます。</w:t>
+        <w:t>写真の許諾や解像度に左右されず、銀・箔・特色の朱といった印刷加工で完成度を高められます。</w:t>
       </w:r>
     </w:p>
     <w:p>
       <w:pPr>
-        <w:spacing w:after="0" w:before="60"/>
+        <w:spacing w:after="60" w:before="40"/>
       </w:pPr>
       <w:r>
         <w:rPr>
@@ -309,9 +440,22 @@
         <w:t>ひと言で添えるなら：「案②は“分かりやすさ”、案③は“インパクト”。案①は、貴社の“らしさ”です。」</w:t>
       </w:r>
     </w:p>
+    <w:p>
+      <w:pPr>
+        <w:spacing w:after="0" w:before="0"/>
+      </w:pPr>
+      <w:r>
+        <w:rPr>
+          <w:b w:val="0"/>
+          <w:color w:val="555555"/>
+          <w:sz w:val="15"/>
+        </w:rPr>
+        <w:t>制作プロセスについて：本3案は、表現の方向性を短期間で幅広く検討するためにAIを活用して制作しました。ご選定いただいた案は、デザイナーが書体・色・印刷仕様まで設計し直し、本制作として仕上げます。</w:t>
+      </w:r>
+    </w:p>
     <w:sectPr>
       <w:pgSz w:w="11906" w:h="16838"/>
-      <w:pgMar w:top="737" w:right="907" w:bottom="624" w:left="907" w:header="720" w:footer="720" w:gutter="0"/>
+      <w:pgMar w:top="624" w:right="794" w:bottom="510" w:left="794" w:header="720" w:footer="720" w:gutter="0"/>
       <w:cols w:space="720"/>
       <w:docGrid w:linePitch="360"/>
     </w:sectPr>
@@ -683,11 +827,11 @@
     <w:qFormat/>
     <w:rsid w:val="00FC693F"/>
     <w:pPr>
-      <w:spacing w:after="0" w:line="300" w:lineRule="auto"/>
+      <w:spacing w:after="0" w:line="269" w:lineRule="auto"/>
     </w:pPr>
     <w:rPr>
       <w:rFonts w:ascii="Yu Gothic" w:hAnsi="Yu Gothic" w:eastAsia="Yu Gothic"/>
-      <w:sz w:val="19"/>
+      <w:sz w:val="17"/>
     </w:rPr>
   </w:style>
   <w:style w:type="paragraph" w:styleId="Header">

</xml_diff>